<commit_message>
Updated ELC Module 1
</commit_message>
<xml_diff>
--- a/trainings/2026 ELC Training/Module 1/2- Case Study/Week 1-Reading Guide.docx
+++ b/trainings/2026 ELC Training/Module 1/2- Case Study/Week 1-Reading Guide.docx
@@ -164,14 +164,24 @@
     </w:p>
     <w:p>
       <w:pPr>
+        <w:pStyle w:val="Normal"/>
         <w:spacing w:after="150" w:line="240" w:lineRule="auto"/>
+        <w:rPr>
+          <w:noProof w:val="0"/>
+          <w:kern w:val="0"/>
+          <w:lang w:val="en-US"/>
+          <w14:ligatures w14:val="none"/>
+        </w:rPr>
+      </w:pPr>
+      <w:r>
         <w:rPr>
           <w:rFonts w:ascii="Arial" w:hAnsi="Arial" w:eastAsia="Times New Roman" w:cs="Arial"/>
           <w:color w:val="1F1F1F"/>
           <w:kern w:val="0"/>
           <w14:ligatures w14:val="none"/>
         </w:rPr>
-      </w:pPr>
+        <w:t>R</w:t>
+      </w:r>
       <w:r>
         <w:rPr>
           <w:rFonts w:ascii="Arial" w:hAnsi="Arial" w:eastAsia="Times New Roman" w:cs="Arial"/>
@@ -179,15 +189,6 @@
           <w:kern w:val="0"/>
           <w14:ligatures w14:val="none"/>
         </w:rPr>
-        <w:t>R</w:t>
-      </w:r>
-      <w:r>
-        <w:rPr>
-          <w:rFonts w:ascii="Arial" w:hAnsi="Arial" w:eastAsia="Times New Roman" w:cs="Arial"/>
-          <w:color w:val="1F1F1F"/>
-          <w:kern w:val="0"/>
-          <w14:ligatures w14:val="none"/>
-        </w:rPr>
         <w:t xml:space="preserve">eview these key terms prior to </w:t>
       </w:r>
       <w:r>
@@ -203,6 +204,79 @@
           <w:color w:val="1F1F1F"/>
         </w:rPr>
         <w:t xml:space="preserve"> the paper.</w:t>
+      </w:r>
+      <w:r>
+        <w:rPr>
+          <w:rFonts w:ascii="Arial" w:hAnsi="Arial" w:eastAsia="Times New Roman" w:cs="Arial"/>
+          <w:color w:val="1F1F1F"/>
+        </w:rPr>
+        <w:t xml:space="preserve"> Add any other terms you </w:t>
+      </w:r>
+      <w:r>
+        <w:rPr>
+          <w:rFonts w:ascii="Arial" w:hAnsi="Arial" w:eastAsia="Times New Roman" w:cs="Arial"/>
+          <w:color w:val="1F1F1F"/>
+        </w:rPr>
+        <w:t>would consider jargon</w:t>
+      </w:r>
+      <w:r>
+        <w:rPr>
+          <w:rFonts w:ascii="Arial" w:hAnsi="Arial" w:eastAsia="Times New Roman" w:cs="Arial"/>
+          <w:color w:val="1F1F1F"/>
+        </w:rPr>
+        <w:t xml:space="preserve">. If time </w:t>
+      </w:r>
+      <w:r>
+        <w:rPr>
+          <w:rFonts w:ascii="Arial" w:hAnsi="Arial" w:eastAsia="Times New Roman" w:cs="Arial"/>
+          <w:color w:val="1F1F1F"/>
+        </w:rPr>
+        <w:t>permits</w:t>
+      </w:r>
+      <w:r>
+        <w:rPr>
+          <w:rFonts w:ascii="Arial" w:hAnsi="Arial" w:eastAsia="Times New Roman" w:cs="Arial"/>
+          <w:color w:val="1F1F1F"/>
+        </w:rPr>
+        <w:t xml:space="preserve">, please add any </w:t>
+      </w:r>
+      <w:r>
+        <w:rPr>
+          <w:rFonts w:ascii="Arial" w:hAnsi="Arial" w:eastAsia="Times New Roman" w:cs="Arial"/>
+          <w:color w:val="1F1F1F"/>
+        </w:rPr>
+        <w:t>additional</w:t>
+      </w:r>
+      <w:r>
+        <w:rPr>
+          <w:rFonts w:ascii="Arial" w:hAnsi="Arial" w:eastAsia="Times New Roman" w:cs="Arial"/>
+          <w:color w:val="1F1F1F"/>
+        </w:rPr>
+        <w:t xml:space="preserve"> terms to the </w:t>
+      </w:r>
+      <w:hyperlink r:id="R7bcea532249942fb">
+        <w:r>
+          <w:rPr>
+            <w:rStyle w:val="Hyperlink"/>
+            <w:noProof w:val="0"/>
+            <w:lang w:val="en-US"/>
+          </w:rPr>
+          <w:t>Jargon Dictionary</w:t>
+        </w:r>
+      </w:hyperlink>
+      <w:r>
+        <w:rPr>
+          <w:noProof w:val="0"/>
+          <w:lang w:val="en-US"/>
+        </w:rPr>
+        <w:t xml:space="preserve"> for the ser</w:t>
+      </w:r>
+      <w:r>
+        <w:rPr>
+          <w:noProof w:val="0"/>
+          <w:lang w:val="en-US"/>
+        </w:rPr>
+        <w:t>ies.</w:t>
       </w:r>
     </w:p>
     <w:tbl>
@@ -1561,6 +1635,534 @@
           </w:p>
         </w:tc>
       </w:tr>
+      <w:tr>
+        <w:trPr>
+          <w:tblCellSpacing w:w="15" w:type="dxa"/>
+          <w:trHeight w:val="300"/>
+        </w:trPr>
+        <w:tc>
+          <w:tcPr>
+            <w:tcW w:w="2556" w:type="dxa"/>
+            <w:tcBorders>
+              <w:top w:val="single" w:color="C4C7C5" w:sz="6" w:space="0"/>
+              <w:left w:val="single" w:color="C4C7C5" w:sz="6" w:space="0"/>
+              <w:bottom w:val="single" w:color="C4C7C5" w:sz="6" w:space="0"/>
+              <w:right w:val="single" w:color="C4C7C5" w:sz="6" w:space="0"/>
+            </w:tcBorders>
+            <w:tcMar>
+              <w:top w:w="120" w:type="dxa"/>
+              <w:left w:w="180" w:type="dxa"/>
+              <w:bottom w:w="120" w:type="dxa"/>
+              <w:right w:w="180" w:type="dxa"/>
+            </w:tcMar>
+            <w:vAlign w:val="center"/>
+            <w:hideMark/>
+          </w:tcPr>
+          <w:p>
+            <w:pPr>
+              <w:pStyle w:val="Normal"/>
+              <w:spacing w:line="240" w:lineRule="auto"/>
+              <w:rPr>
+                <w:rFonts w:ascii="Arial" w:hAnsi="Arial" w:eastAsia="Times New Roman" w:cs="Arial"/>
+                <w:b w:val="1"/>
+                <w:bCs w:val="1"/>
+                <w:color w:val="1F1F1F"/>
+                <w:sz w:val="20"/>
+                <w:szCs w:val="20"/>
+              </w:rPr>
+            </w:pPr>
+          </w:p>
+        </w:tc>
+        <w:tc>
+          <w:tcPr>
+            <w:tcW w:w="1849" w:type="dxa"/>
+            <w:tcBorders>
+              <w:top w:val="single" w:color="C4C7C5" w:sz="6" w:space="0"/>
+              <w:left w:val="single" w:color="C4C7C5" w:sz="6" w:space="0"/>
+              <w:bottom w:val="single" w:color="C4C7C5" w:sz="6" w:space="0"/>
+              <w:right w:val="single" w:color="C4C7C5" w:sz="6" w:space="0"/>
+            </w:tcBorders>
+            <w:tcMar>
+              <w:top w:w="120" w:type="dxa"/>
+              <w:left w:w="180" w:type="dxa"/>
+              <w:bottom w:w="120" w:type="dxa"/>
+              <w:right w:w="180" w:type="dxa"/>
+            </w:tcMar>
+            <w:vAlign w:val="center"/>
+            <w:hideMark/>
+          </w:tcPr>
+          <w:p>
+            <w:pPr>
+              <w:pStyle w:val="Normal"/>
+              <w:spacing w:line="240" w:lineRule="auto"/>
+              <w:rPr>
+                <w:rFonts w:ascii="Arial" w:hAnsi="Arial" w:eastAsia="Times New Roman" w:cs="Arial"/>
+                <w:color w:val="1F1F1F"/>
+                <w:sz w:val="20"/>
+                <w:szCs w:val="20"/>
+              </w:rPr>
+            </w:pPr>
+          </w:p>
+        </w:tc>
+        <w:tc>
+          <w:tcPr>
+            <w:tcW w:w="3122" w:type="dxa"/>
+            <w:tcBorders>
+              <w:top w:val="single" w:color="C4C7C5" w:sz="6" w:space="0"/>
+              <w:left w:val="single" w:color="C4C7C5" w:sz="6" w:space="0"/>
+              <w:bottom w:val="single" w:color="C4C7C5" w:sz="6" w:space="0"/>
+              <w:right w:val="single" w:color="C4C7C5" w:sz="6" w:space="0"/>
+            </w:tcBorders>
+            <w:tcMar>
+              <w:top w:w="120" w:type="dxa"/>
+              <w:left w:w="180" w:type="dxa"/>
+              <w:bottom w:w="120" w:type="dxa"/>
+              <w:right w:w="180" w:type="dxa"/>
+            </w:tcMar>
+            <w:vAlign w:val="center"/>
+            <w:hideMark/>
+          </w:tcPr>
+          <w:p>
+            <w:pPr>
+              <w:pStyle w:val="Normal"/>
+              <w:spacing w:line="240" w:lineRule="auto"/>
+              <w:rPr>
+                <w:rFonts w:ascii="Arial" w:hAnsi="Arial" w:eastAsia="Times New Roman" w:cs="Arial"/>
+                <w:color w:val="1F1F1F"/>
+                <w:sz w:val="20"/>
+                <w:szCs w:val="20"/>
+              </w:rPr>
+            </w:pPr>
+          </w:p>
+        </w:tc>
+        <w:tc>
+          <w:tcPr>
+            <w:tcW w:w="3257" w:type="dxa"/>
+            <w:tcBorders>
+              <w:top w:val="single" w:color="C4C7C5" w:sz="6" w:space="0"/>
+              <w:left w:val="single" w:color="C4C7C5" w:sz="6" w:space="0"/>
+              <w:bottom w:val="single" w:color="C4C7C5" w:sz="6" w:space="0"/>
+              <w:right w:val="single" w:color="C4C7C5" w:sz="6" w:space="0"/>
+            </w:tcBorders>
+            <w:tcMar>
+              <w:top w:w="120" w:type="dxa"/>
+              <w:left w:w="180" w:type="dxa"/>
+              <w:bottom w:w="120" w:type="dxa"/>
+              <w:right w:w="180" w:type="dxa"/>
+            </w:tcMar>
+            <w:vAlign w:val="center"/>
+            <w:hideMark/>
+          </w:tcPr>
+          <w:p>
+            <w:pPr>
+              <w:pStyle w:val="Normal"/>
+              <w:spacing w:line="240" w:lineRule="auto"/>
+              <w:rPr>
+                <w:rFonts w:ascii="Arial" w:hAnsi="Arial" w:eastAsia="Times New Roman" w:cs="Arial"/>
+                <w:color w:val="1F1F1F"/>
+                <w:sz w:val="20"/>
+                <w:szCs w:val="20"/>
+              </w:rPr>
+            </w:pPr>
+          </w:p>
+        </w:tc>
+      </w:tr>
+      <w:tr>
+        <w:trPr>
+          <w:tblCellSpacing w:w="15" w:type="dxa"/>
+          <w:trHeight w:val="300"/>
+        </w:trPr>
+        <w:tc>
+          <w:tcPr>
+            <w:tcW w:w="2556" w:type="dxa"/>
+            <w:tcBorders>
+              <w:top w:val="single" w:color="C4C7C5" w:sz="6" w:space="0"/>
+              <w:left w:val="single" w:color="C4C7C5" w:sz="6" w:space="0"/>
+              <w:bottom w:val="single" w:color="C4C7C5" w:sz="6" w:space="0"/>
+              <w:right w:val="single" w:color="C4C7C5" w:sz="6" w:space="0"/>
+            </w:tcBorders>
+            <w:tcMar>
+              <w:top w:w="120" w:type="dxa"/>
+              <w:left w:w="180" w:type="dxa"/>
+              <w:bottom w:w="120" w:type="dxa"/>
+              <w:right w:w="180" w:type="dxa"/>
+            </w:tcMar>
+            <w:vAlign w:val="center"/>
+            <w:hideMark/>
+          </w:tcPr>
+          <w:p>
+            <w:pPr>
+              <w:pStyle w:val="Normal"/>
+              <w:spacing w:line="240" w:lineRule="auto"/>
+              <w:rPr>
+                <w:rFonts w:ascii="Arial" w:hAnsi="Arial" w:eastAsia="Times New Roman" w:cs="Arial"/>
+                <w:b w:val="1"/>
+                <w:bCs w:val="1"/>
+                <w:color w:val="1F1F1F"/>
+                <w:sz w:val="20"/>
+                <w:szCs w:val="20"/>
+              </w:rPr>
+            </w:pPr>
+          </w:p>
+        </w:tc>
+        <w:tc>
+          <w:tcPr>
+            <w:tcW w:w="1849" w:type="dxa"/>
+            <w:tcBorders>
+              <w:top w:val="single" w:color="C4C7C5" w:sz="6" w:space="0"/>
+              <w:left w:val="single" w:color="C4C7C5" w:sz="6" w:space="0"/>
+              <w:bottom w:val="single" w:color="C4C7C5" w:sz="6" w:space="0"/>
+              <w:right w:val="single" w:color="C4C7C5" w:sz="6" w:space="0"/>
+            </w:tcBorders>
+            <w:tcMar>
+              <w:top w:w="120" w:type="dxa"/>
+              <w:left w:w="180" w:type="dxa"/>
+              <w:bottom w:w="120" w:type="dxa"/>
+              <w:right w:w="180" w:type="dxa"/>
+            </w:tcMar>
+            <w:vAlign w:val="center"/>
+            <w:hideMark/>
+          </w:tcPr>
+          <w:p>
+            <w:pPr>
+              <w:pStyle w:val="Normal"/>
+              <w:spacing w:line="240" w:lineRule="auto"/>
+              <w:rPr>
+                <w:rFonts w:ascii="Arial" w:hAnsi="Arial" w:eastAsia="Times New Roman" w:cs="Arial"/>
+                <w:color w:val="1F1F1F"/>
+                <w:sz w:val="20"/>
+                <w:szCs w:val="20"/>
+              </w:rPr>
+            </w:pPr>
+          </w:p>
+        </w:tc>
+        <w:tc>
+          <w:tcPr>
+            <w:tcW w:w="3122" w:type="dxa"/>
+            <w:tcBorders>
+              <w:top w:val="single" w:color="C4C7C5" w:sz="6" w:space="0"/>
+              <w:left w:val="single" w:color="C4C7C5" w:sz="6" w:space="0"/>
+              <w:bottom w:val="single" w:color="C4C7C5" w:sz="6" w:space="0"/>
+              <w:right w:val="single" w:color="C4C7C5" w:sz="6" w:space="0"/>
+            </w:tcBorders>
+            <w:tcMar>
+              <w:top w:w="120" w:type="dxa"/>
+              <w:left w:w="180" w:type="dxa"/>
+              <w:bottom w:w="120" w:type="dxa"/>
+              <w:right w:w="180" w:type="dxa"/>
+            </w:tcMar>
+            <w:vAlign w:val="center"/>
+            <w:hideMark/>
+          </w:tcPr>
+          <w:p>
+            <w:pPr>
+              <w:pStyle w:val="Normal"/>
+              <w:spacing w:line="240" w:lineRule="auto"/>
+              <w:rPr>
+                <w:rFonts w:ascii="Arial" w:hAnsi="Arial" w:eastAsia="Times New Roman" w:cs="Arial"/>
+                <w:color w:val="1F1F1F"/>
+                <w:sz w:val="20"/>
+                <w:szCs w:val="20"/>
+              </w:rPr>
+            </w:pPr>
+          </w:p>
+        </w:tc>
+        <w:tc>
+          <w:tcPr>
+            <w:tcW w:w="3257" w:type="dxa"/>
+            <w:tcBorders>
+              <w:top w:val="single" w:color="C4C7C5" w:sz="6" w:space="0"/>
+              <w:left w:val="single" w:color="C4C7C5" w:sz="6" w:space="0"/>
+              <w:bottom w:val="single" w:color="C4C7C5" w:sz="6" w:space="0"/>
+              <w:right w:val="single" w:color="C4C7C5" w:sz="6" w:space="0"/>
+            </w:tcBorders>
+            <w:tcMar>
+              <w:top w:w="120" w:type="dxa"/>
+              <w:left w:w="180" w:type="dxa"/>
+              <w:bottom w:w="120" w:type="dxa"/>
+              <w:right w:w="180" w:type="dxa"/>
+            </w:tcMar>
+            <w:vAlign w:val="center"/>
+            <w:hideMark/>
+          </w:tcPr>
+          <w:p>
+            <w:pPr>
+              <w:pStyle w:val="Normal"/>
+              <w:spacing w:line="240" w:lineRule="auto"/>
+              <w:rPr>
+                <w:rFonts w:ascii="Arial" w:hAnsi="Arial" w:eastAsia="Times New Roman" w:cs="Arial"/>
+                <w:color w:val="1F1F1F"/>
+                <w:sz w:val="20"/>
+                <w:szCs w:val="20"/>
+              </w:rPr>
+            </w:pPr>
+          </w:p>
+        </w:tc>
+      </w:tr>
+      <w:tr>
+        <w:trPr>
+          <w:tblCellSpacing w:w="15" w:type="dxa"/>
+          <w:trHeight w:val="300"/>
+        </w:trPr>
+        <w:tc>
+          <w:tcPr>
+            <w:tcW w:w="2556" w:type="dxa"/>
+            <w:tcBorders>
+              <w:top w:val="single" w:color="C4C7C5" w:sz="6" w:space="0"/>
+              <w:left w:val="single" w:color="C4C7C5" w:sz="6" w:space="0"/>
+              <w:bottom w:val="single" w:color="C4C7C5" w:sz="6" w:space="0"/>
+              <w:right w:val="single" w:color="C4C7C5" w:sz="6" w:space="0"/>
+            </w:tcBorders>
+            <w:tcMar>
+              <w:top w:w="120" w:type="dxa"/>
+              <w:left w:w="180" w:type="dxa"/>
+              <w:bottom w:w="120" w:type="dxa"/>
+              <w:right w:w="180" w:type="dxa"/>
+            </w:tcMar>
+            <w:vAlign w:val="center"/>
+            <w:hideMark/>
+          </w:tcPr>
+          <w:p>
+            <w:pPr>
+              <w:pStyle w:val="Normal"/>
+              <w:spacing w:line="240" w:lineRule="auto"/>
+              <w:rPr>
+                <w:rFonts w:ascii="Arial" w:hAnsi="Arial" w:eastAsia="Times New Roman" w:cs="Arial"/>
+                <w:b w:val="1"/>
+                <w:bCs w:val="1"/>
+                <w:color w:val="1F1F1F"/>
+                <w:sz w:val="20"/>
+                <w:szCs w:val="20"/>
+              </w:rPr>
+            </w:pPr>
+          </w:p>
+        </w:tc>
+        <w:tc>
+          <w:tcPr>
+            <w:tcW w:w="1849" w:type="dxa"/>
+            <w:tcBorders>
+              <w:top w:val="single" w:color="C4C7C5" w:sz="6" w:space="0"/>
+              <w:left w:val="single" w:color="C4C7C5" w:sz="6" w:space="0"/>
+              <w:bottom w:val="single" w:color="C4C7C5" w:sz="6" w:space="0"/>
+              <w:right w:val="single" w:color="C4C7C5" w:sz="6" w:space="0"/>
+            </w:tcBorders>
+            <w:tcMar>
+              <w:top w:w="120" w:type="dxa"/>
+              <w:left w:w="180" w:type="dxa"/>
+              <w:bottom w:w="120" w:type="dxa"/>
+              <w:right w:w="180" w:type="dxa"/>
+            </w:tcMar>
+            <w:vAlign w:val="center"/>
+            <w:hideMark/>
+          </w:tcPr>
+          <w:p>
+            <w:pPr>
+              <w:pStyle w:val="Normal"/>
+              <w:spacing w:line="240" w:lineRule="auto"/>
+              <w:rPr>
+                <w:rFonts w:ascii="Arial" w:hAnsi="Arial" w:eastAsia="Times New Roman" w:cs="Arial"/>
+                <w:color w:val="1F1F1F"/>
+                <w:sz w:val="20"/>
+                <w:szCs w:val="20"/>
+              </w:rPr>
+            </w:pPr>
+          </w:p>
+        </w:tc>
+        <w:tc>
+          <w:tcPr>
+            <w:tcW w:w="3122" w:type="dxa"/>
+            <w:tcBorders>
+              <w:top w:val="single" w:color="C4C7C5" w:sz="6" w:space="0"/>
+              <w:left w:val="single" w:color="C4C7C5" w:sz="6" w:space="0"/>
+              <w:bottom w:val="single" w:color="C4C7C5" w:sz="6" w:space="0"/>
+              <w:right w:val="single" w:color="C4C7C5" w:sz="6" w:space="0"/>
+            </w:tcBorders>
+            <w:tcMar>
+              <w:top w:w="120" w:type="dxa"/>
+              <w:left w:w="180" w:type="dxa"/>
+              <w:bottom w:w="120" w:type="dxa"/>
+              <w:right w:w="180" w:type="dxa"/>
+            </w:tcMar>
+            <w:vAlign w:val="center"/>
+            <w:hideMark/>
+          </w:tcPr>
+          <w:p>
+            <w:pPr>
+              <w:pStyle w:val="Normal"/>
+              <w:spacing w:line="240" w:lineRule="auto"/>
+              <w:rPr>
+                <w:rFonts w:ascii="Arial" w:hAnsi="Arial" w:eastAsia="Times New Roman" w:cs="Arial"/>
+                <w:color w:val="1F1F1F"/>
+                <w:sz w:val="20"/>
+                <w:szCs w:val="20"/>
+              </w:rPr>
+            </w:pPr>
+          </w:p>
+        </w:tc>
+        <w:tc>
+          <w:tcPr>
+            <w:tcW w:w="3257" w:type="dxa"/>
+            <w:tcBorders>
+              <w:top w:val="single" w:color="C4C7C5" w:sz="6" w:space="0"/>
+              <w:left w:val="single" w:color="C4C7C5" w:sz="6" w:space="0"/>
+              <w:bottom w:val="single" w:color="C4C7C5" w:sz="6" w:space="0"/>
+              <w:right w:val="single" w:color="C4C7C5" w:sz="6" w:space="0"/>
+            </w:tcBorders>
+            <w:tcMar>
+              <w:top w:w="120" w:type="dxa"/>
+              <w:left w:w="180" w:type="dxa"/>
+              <w:bottom w:w="120" w:type="dxa"/>
+              <w:right w:w="180" w:type="dxa"/>
+            </w:tcMar>
+            <w:vAlign w:val="center"/>
+            <w:hideMark/>
+          </w:tcPr>
+          <w:p>
+            <w:pPr>
+              <w:pStyle w:val="Normal"/>
+              <w:spacing w:line="240" w:lineRule="auto"/>
+              <w:rPr>
+                <w:rFonts w:ascii="Arial" w:hAnsi="Arial" w:eastAsia="Times New Roman" w:cs="Arial"/>
+                <w:color w:val="1F1F1F"/>
+                <w:sz w:val="20"/>
+                <w:szCs w:val="20"/>
+              </w:rPr>
+            </w:pPr>
+          </w:p>
+        </w:tc>
+      </w:tr>
+      <w:tr>
+        <w:trPr>
+          <w:tblCellSpacing w:w="15" w:type="dxa"/>
+          <w:trHeight w:val="300"/>
+        </w:trPr>
+        <w:tc>
+          <w:tcPr>
+            <w:tcW w:w="2556" w:type="dxa"/>
+            <w:tcBorders>
+              <w:top w:val="single" w:color="C4C7C5" w:sz="6" w:space="0"/>
+              <w:left w:val="single" w:color="C4C7C5" w:sz="6" w:space="0"/>
+              <w:bottom w:val="single" w:color="C4C7C5" w:sz="6" w:space="0"/>
+              <w:right w:val="single" w:color="C4C7C5" w:sz="6" w:space="0"/>
+            </w:tcBorders>
+            <w:tcMar>
+              <w:top w:w="120" w:type="dxa"/>
+              <w:left w:w="180" w:type="dxa"/>
+              <w:bottom w:w="120" w:type="dxa"/>
+              <w:right w:w="180" w:type="dxa"/>
+            </w:tcMar>
+            <w:vAlign w:val="center"/>
+            <w:hideMark/>
+          </w:tcPr>
+          <w:p>
+            <w:pPr>
+              <w:pStyle w:val="Normal"/>
+              <w:spacing w:line="240" w:lineRule="auto"/>
+              <w:rPr>
+                <w:rFonts w:ascii="Arial" w:hAnsi="Arial" w:eastAsia="Times New Roman" w:cs="Arial"/>
+                <w:b w:val="1"/>
+                <w:bCs w:val="1"/>
+                <w:color w:val="1F1F1F"/>
+                <w:sz w:val="20"/>
+                <w:szCs w:val="20"/>
+              </w:rPr>
+            </w:pPr>
+          </w:p>
+        </w:tc>
+        <w:tc>
+          <w:tcPr>
+            <w:tcW w:w="1849" w:type="dxa"/>
+            <w:tcBorders>
+              <w:top w:val="single" w:color="C4C7C5" w:sz="6" w:space="0"/>
+              <w:left w:val="single" w:color="C4C7C5" w:sz="6" w:space="0"/>
+              <w:bottom w:val="single" w:color="C4C7C5" w:sz="6" w:space="0"/>
+              <w:right w:val="single" w:color="C4C7C5" w:sz="6" w:space="0"/>
+            </w:tcBorders>
+            <w:tcMar>
+              <w:top w:w="120" w:type="dxa"/>
+              <w:left w:w="180" w:type="dxa"/>
+              <w:bottom w:w="120" w:type="dxa"/>
+              <w:right w:w="180" w:type="dxa"/>
+            </w:tcMar>
+            <w:vAlign w:val="center"/>
+            <w:hideMark/>
+          </w:tcPr>
+          <w:p>
+            <w:pPr>
+              <w:pStyle w:val="Normal"/>
+              <w:spacing w:line="240" w:lineRule="auto"/>
+              <w:rPr>
+                <w:rFonts w:ascii="Arial" w:hAnsi="Arial" w:eastAsia="Times New Roman" w:cs="Arial"/>
+                <w:color w:val="1F1F1F"/>
+                <w:sz w:val="20"/>
+                <w:szCs w:val="20"/>
+              </w:rPr>
+            </w:pPr>
+          </w:p>
+        </w:tc>
+        <w:tc>
+          <w:tcPr>
+            <w:tcW w:w="3122" w:type="dxa"/>
+            <w:tcBorders>
+              <w:top w:val="single" w:color="C4C7C5" w:sz="6" w:space="0"/>
+              <w:left w:val="single" w:color="C4C7C5" w:sz="6" w:space="0"/>
+              <w:bottom w:val="single" w:color="C4C7C5" w:sz="6" w:space="0"/>
+              <w:right w:val="single" w:color="C4C7C5" w:sz="6" w:space="0"/>
+            </w:tcBorders>
+            <w:tcMar>
+              <w:top w:w="120" w:type="dxa"/>
+              <w:left w:w="180" w:type="dxa"/>
+              <w:bottom w:w="120" w:type="dxa"/>
+              <w:right w:w="180" w:type="dxa"/>
+            </w:tcMar>
+            <w:vAlign w:val="center"/>
+            <w:hideMark/>
+          </w:tcPr>
+          <w:p>
+            <w:pPr>
+              <w:pStyle w:val="Normal"/>
+              <w:spacing w:line="240" w:lineRule="auto"/>
+              <w:rPr>
+                <w:rFonts w:ascii="Arial" w:hAnsi="Arial" w:eastAsia="Times New Roman" w:cs="Arial"/>
+                <w:color w:val="1F1F1F"/>
+                <w:sz w:val="20"/>
+                <w:szCs w:val="20"/>
+              </w:rPr>
+            </w:pPr>
+          </w:p>
+        </w:tc>
+        <w:tc>
+          <w:tcPr>
+            <w:tcW w:w="3257" w:type="dxa"/>
+            <w:tcBorders>
+              <w:top w:val="single" w:color="C4C7C5" w:sz="6" w:space="0"/>
+              <w:left w:val="single" w:color="C4C7C5" w:sz="6" w:space="0"/>
+              <w:bottom w:val="single" w:color="C4C7C5" w:sz="6" w:space="0"/>
+              <w:right w:val="single" w:color="C4C7C5" w:sz="6" w:space="0"/>
+            </w:tcBorders>
+            <w:tcMar>
+              <w:top w:w="120" w:type="dxa"/>
+              <w:left w:w="180" w:type="dxa"/>
+              <w:bottom w:w="120" w:type="dxa"/>
+              <w:right w:w="180" w:type="dxa"/>
+            </w:tcMar>
+            <w:vAlign w:val="center"/>
+            <w:hideMark/>
+          </w:tcPr>
+          <w:p>
+            <w:pPr>
+              <w:pStyle w:val="Normal"/>
+              <w:spacing w:line="240" w:lineRule="auto"/>
+              <w:rPr>
+                <w:rFonts w:ascii="Arial" w:hAnsi="Arial" w:eastAsia="Times New Roman" w:cs="Arial"/>
+                <w:color w:val="1F1F1F"/>
+                <w:sz w:val="20"/>
+                <w:szCs w:val="20"/>
+              </w:rPr>
+            </w:pPr>
+          </w:p>
+        </w:tc>
+      </w:tr>
     </w:tbl>
     <w:p>
       <w:pPr>
@@ -1570,6 +2172,20 @@
           <w:color w:val="1F1F1F"/>
           <w:kern w:val="0"/>
           <w14:ligatures w14:val="none"/>
+        </w:rPr>
+      </w:pPr>
+    </w:p>
+    <w:p>
+      <w:pPr>
+        <w:pStyle w:val="Normal"/>
+        <w:spacing w:after="120" w:line="240" w:lineRule="auto"/>
+        <w:rPr>
+          <w:rFonts w:ascii="Arial" w:hAnsi="Arial" w:eastAsia="Times New Roman" w:cs="Arial"/>
+          <w:b w:val="1"/>
+          <w:bCs w:val="1"/>
+          <w:color w:val="1F1F1F"/>
+          <w:sz w:val="36"/>
+          <w:szCs w:val="36"/>
         </w:rPr>
       </w:pPr>
     </w:p>
@@ -1615,7 +2231,7 @@
     <w:p>
       <w:pPr>
         <w:pStyle w:val="NormalWeb"/>
-        <w:spacing w:before="0" w:beforeAutospacing="off" w:after="150" w:afterAutospacing="off" w:line="240" w:lineRule="auto"/>
+        <w:spacing w:before="0" w:beforeAutospacing="off" w:after="150" w:afterAutospacing="off" w:line="360" w:lineRule="auto"/>
         <w:rPr>
           <w:rFonts w:ascii="Arial" w:hAnsi="Arial" w:eastAsia="Arial" w:cs="Arial"/>
           <w:b w:val="0"/>
@@ -1631,7 +2247,11 @@
           <w:lang w:val="en-US"/>
         </w:rPr>
       </w:pPr>
-      <w:r>
+    </w:p>
+    <w:p>
+      <w:pPr>
+        <w:pStyle w:val="NormalWeb"/>
+        <w:spacing w:before="0" w:beforeAutospacing="off" w:after="150" w:afterAutospacing="off" w:line="360" w:lineRule="auto"/>
         <w:rPr>
           <w:rFonts w:ascii="Arial" w:hAnsi="Arial" w:eastAsia="Arial" w:cs="Arial"/>
           <w:b w:val="0"/>
@@ -1646,13 +2266,8 @@
           <w:szCs w:val="24"/>
           <w:lang w:val="en-US"/>
         </w:rPr>
-        <w:t>When treated as a foundational case study on the role of genomics in public health, the Gardy et al. (2011) paper serves as a perfect bridge between traditional field epidemiology and modern precision public health. Published at the dawn of the genomic revolution in infectious disease tracking, this seminal study transformed whole-genome sequencing (WGS) from a retrospective academic curiosity into an actionable, frontline public health tool.</w:t>
-      </w:r>
-    </w:p>
-    <w:p>
-      <w:pPr>
-        <w:pStyle w:val="NormalWeb"/>
-        <w:spacing w:before="0" w:beforeAutospacing="off" w:after="150" w:afterAutospacing="off" w:line="240" w:lineRule="auto"/>
+      </w:pPr>
+      <w:r>
         <w:rPr>
           <w:rFonts w:ascii="Arial" w:hAnsi="Arial" w:eastAsia="Arial" w:cs="Arial"/>
           <w:b w:val="0"/>
@@ -1667,8 +2282,13 @@
           <w:szCs w:val="24"/>
           <w:lang w:val="en-US"/>
         </w:rPr>
-      </w:pPr>
-      <w:r>
+        <w:t>When treated as a foundational case study on the role of genomics in public health, the Gardy et al. (2011) paper serves as a perfect bridge between traditional field epidemiology and modern precision public health. Published at the dawn of the genomic revolution in infectious disease tracking, this seminal study transformed whole-genome sequencing (WGS) from a retrospective academic curiosity into an actionable, frontline public health tool.</w:t>
+      </w:r>
+    </w:p>
+    <w:p>
+      <w:pPr>
+        <w:pStyle w:val="NormalWeb"/>
+        <w:spacing w:before="0" w:beforeAutospacing="off" w:after="150" w:afterAutospacing="off" w:line="360" w:lineRule="auto"/>
         <w:rPr>
           <w:rFonts w:ascii="Arial" w:hAnsi="Arial" w:eastAsia="Arial" w:cs="Arial"/>
           <w:b w:val="0"/>
@@ -1683,13 +2303,8 @@
           <w:szCs w:val="24"/>
           <w:lang w:val="en-US"/>
         </w:rPr>
-        <w:t>For decades, tracking infectious diseases relied on two main tools: classic "shoe-leather" detective work (interviewing patients, mapping contacts, and tracing social overlaps) and low-resolution laboratory genotyping. While helpful, this approach had major blind spots. Traditional genotyping could tell if two germs were similar, but they couldn't prove whether Person A actually infected Person B. Meanwhile, interviews depended on human memory and trust, meaning people often forgot brief interactions or hid visits to illegal or stigmatized spaces.</w:t>
-      </w:r>
-    </w:p>
-    <w:p>
-      <w:pPr>
-        <w:pStyle w:val="NormalWeb"/>
-        <w:spacing w:before="0" w:beforeAutospacing="off" w:after="150" w:afterAutospacing="off" w:line="240" w:lineRule="auto"/>
+      </w:pPr>
+      <w:r>
         <w:rPr>
           <w:rFonts w:ascii="Arial" w:hAnsi="Arial" w:eastAsia="Arial" w:cs="Arial"/>
           <w:b w:val="0"/>
@@ -1704,8 +2319,13 @@
           <w:szCs w:val="24"/>
           <w:lang w:val="en-US"/>
         </w:rPr>
-      </w:pPr>
-      <w:r>
+        <w:t>For decades, tracking infectious diseases relied on two main tools: classic "shoe-leather" detective work (interviewing patients, mapping contacts, and tracing social overlaps) and low-resolution laboratory genotyping. While helpful, this approach had major blind spots. Traditional genotyping could tell if two germs were similar, but they couldn't prove whether Person A actually infected Person B. Meanwhile, interviews depended on human memory and trust, meaning people often forgot brief interactions or hid visits to illegal or stigmatized spaces.</w:t>
+      </w:r>
+    </w:p>
+    <w:p>
+      <w:pPr>
+        <w:pStyle w:val="NormalWeb"/>
+        <w:spacing w:before="0" w:beforeAutospacing="off" w:after="150" w:afterAutospacing="off" w:line="360" w:lineRule="auto"/>
         <w:rPr>
           <w:rFonts w:ascii="Arial" w:hAnsi="Arial" w:eastAsia="Arial" w:cs="Arial"/>
           <w:b w:val="0"/>
@@ -1720,13 +2340,29 @@
           <w:szCs w:val="24"/>
           <w:lang w:val="en-US"/>
         </w:rPr>
+      </w:pPr>
+      <w:r>
+        <w:rPr>
+          <w:rFonts w:ascii="Arial" w:hAnsi="Arial" w:eastAsia="Arial" w:cs="Arial"/>
+          <w:b w:val="0"/>
+          <w:bCs w:val="0"/>
+          <w:i w:val="0"/>
+          <w:iCs w:val="0"/>
+          <w:caps w:val="0"/>
+          <w:smallCaps w:val="0"/>
+          <w:noProof w:val="0"/>
+          <w:color w:val="1F1F1F"/>
+          <w:sz w:val="24"/>
+          <w:szCs w:val="24"/>
+          <w:lang w:val="en-US"/>
+        </w:rPr>
         <w:t>The Gardy study changed everything during a sudden, severe spike in tuberculosis (TB) cases in British Columbia. At first, health officials feared the worst: standard tests suggested a terrifying "superbug" mutant strain was spreading fast. But by sequencing the genome of the bacteria and combining that data with maps of the patients' social connections, the researchers uncovered a completely different reality: The bacteria hadn’t changed and certainly not mutated into a super-strain. The study found that social factors were driving spread. The real culprit was a shift in community conditions—specifically, the opening of a local crack house, which created a high-risk environment for transmission. Furthermore, what looked like one massive runaway outbreak was found to be actually two separate chains of transmission happening at the exact same time in the same neighborhood.</w:t>
       </w:r>
     </w:p>
     <w:p>
       <w:pPr>
         <w:pStyle w:val="NormalWeb"/>
-        <w:spacing w:before="0" w:beforeAutospacing="off" w:after="150" w:afterAutospacing="off" w:line="240" w:lineRule="auto"/>
+        <w:spacing w:before="0" w:beforeAutospacing="off" w:after="150" w:afterAutospacing="off" w:line="360" w:lineRule="auto"/>
         <w:rPr>
           <w:rFonts w:ascii="Arial" w:hAnsi="Arial" w:eastAsia="Arial" w:cs="Arial"/>
           <w:b w:val="0"/>
@@ -1791,6 +2427,28 @@
           <w:b w:val="1"/>
           <w:bCs w:val="1"/>
           <w:color w:val="1F1F1F"/>
+          <w:sz w:val="36"/>
+          <w:szCs w:val="36"/>
+        </w:rPr>
+      </w:pPr>
+    </w:p>
+    <w:p>
+      <w:pPr>
+        <w:spacing w:after="120" w:line="240" w:lineRule="auto"/>
+      </w:pPr>
+      <w:r>
+        <w:br w:type="page"/>
+      </w:r>
+    </w:p>
+    <w:p>
+      <w:pPr>
+        <w:pStyle w:val="Normal"/>
+        <w:spacing w:after="120" w:line="240" w:lineRule="auto"/>
+        <w:rPr>
+          <w:rFonts w:ascii="Arial" w:hAnsi="Arial" w:eastAsia="Times New Roman" w:cs="Arial"/>
+          <w:b w:val="1"/>
+          <w:bCs w:val="1"/>
+          <w:color w:val="1F1F1F"/>
           <w:kern w:val="0"/>
           <w:sz w:val="36"/>
           <w:szCs w:val="36"/>
@@ -1877,7 +2535,7 @@
           <w:szCs w:val="28"/>
           <w14:ligatures w14:val="none"/>
         </w:rPr>
-        <w:t>thodology &amp; Technology Shift</w:t>
+        <w:t>thodology Shift</w:t>
       </w:r>
     </w:p>
     <w:p>
@@ -1897,24 +2555,37 @@
       <w:r>
         <w:rPr>
           <w:rFonts w:ascii="Arial" w:hAnsi="Arial" w:eastAsia="Times New Roman" w:cs="Arial"/>
-          <w:b/>
-          <w:bCs/>
           <w:color w:val="1F1F1F"/>
           <w:kern w:val="0"/>
           <w:bdr w:val="none" w:color="auto" w:sz="0" w:space="0" w:frame="1"/>
           <w14:ligatures w14:val="none"/>
         </w:rPr>
-        <w:t>Resolution vs. Reliance:</w:t>
-      </w:r>
-      <w:r>
-        <w:rPr>
-          <w:rFonts w:ascii="Arial" w:hAnsi="Arial" w:eastAsia="Times New Roman" w:cs="Arial"/>
-          <w:color w:val="1F1F1F"/>
-          <w:kern w:val="0"/>
-          <w14:ligatures w14:val="none"/>
-        </w:rPr>
-        <w:t xml:space="preserve"> The authors demonstrated that the standard genotyping method at the time (MIRU-VNTR) grouped two distinct bacterial lineages into a single cluster. What does this reveal about the limitations of relying on a few highly variable genetic loci versus sequencing the entire genome? How might this false grouping have misled an investigation in real-time?</w:t>
-      </w:r>
+        <w:t xml:space="preserve">The authors </w:t>
+      </w:r>
+      <w:r>
+        <w:rPr>
+          <w:rFonts w:ascii="Arial" w:hAnsi="Arial" w:eastAsia="Times New Roman" w:cs="Arial"/>
+          <w:color w:val="1F1F1F"/>
+        </w:rPr>
+        <w:t>demonstrated</w:t>
+      </w:r>
+      <w:r>
+        <w:rPr>
+          <w:rFonts w:ascii="Arial" w:hAnsi="Arial" w:eastAsia="Times New Roman" w:cs="Arial"/>
+          <w:color w:val="1F1F1F"/>
+        </w:rPr>
+        <w:t xml:space="preserve"> that the standard genotyping method at the time (MIRU-VNTR) grouped two distinct bacterial lineages into a single cluster. What does this reveal about the limitations of relying on a few highly variable genetic loci versus sequencing the entire genome? How might this false grouping have misled an investigation in real-time?</w:t>
+      </w:r>
+    </w:p>
+    <w:p>
+      <w:pPr>
+        <w:spacing w:after="0" w:line="240" w:lineRule="auto"/>
+        <w:ind w:left="720"/>
+        <w:rPr>
+          <w:rFonts w:ascii="Arial" w:hAnsi="Arial" w:eastAsia="Times New Roman" w:cs="Arial"/>
+          <w:color w:val="1F1F1F"/>
+        </w:rPr>
+      </w:pPr>
     </w:p>
     <w:p>
       <w:pPr>
@@ -1933,46 +2604,54 @@
       <w:r>
         <w:rPr>
           <w:rFonts w:ascii="Arial" w:hAnsi="Arial" w:eastAsia="Times New Roman" w:cs="Arial"/>
-          <w:b/>
-          <w:bCs/>
+          <w:i w:val="1"/>
+          <w:iCs w:val="1"/>
           <w:color w:val="1F1F1F"/>
           <w:kern w:val="0"/>
           <w:bdr w:val="none" w:color="auto" w:sz="0" w:space="0" w:frame="1"/>
           <w14:ligatures w14:val="none"/>
         </w:rPr>
         <w:lastRenderedPageBreak/>
-        <w:t>The "Molecular Clock" in Slow Mutators:</w:t>
-      </w:r>
-      <w:r>
-        <w:rPr>
-          <w:rFonts w:ascii="Arial" w:hAnsi="Arial" w:eastAsia="Times New Roman" w:cs="Arial"/>
-          <w:color w:val="1F1F1F"/>
-          <w:kern w:val="0"/>
-          <w14:ligatures w14:val="none"/>
-        </w:rPr>
-        <w:t xml:space="preserve"> </w:t>
-      </w:r>
-      <w:r>
-        <w:rPr>
-          <w:rFonts w:ascii="Arial" w:hAnsi="Arial" w:eastAsia="Times New Roman" w:cs="Arial"/>
-          <w:i/>
-          <w:iCs/>
-          <w:color w:val="1F1F1F"/>
-          <w:kern w:val="0"/>
-          <w:bdr w:val="none" w:color="auto" w:sz="0" w:space="0" w:frame="1"/>
-          <w14:ligatures w14:val="none"/>
-        </w:rPr>
         <w:t>Mycobacterium tuberculosis</w:t>
       </w:r>
       <w:r>
         <w:rPr>
           <w:rFonts w:ascii="Arial" w:hAnsi="Arial" w:eastAsia="Times New Roman" w:cs="Arial"/>
           <w:color w:val="1F1F1F"/>
-          <w:kern w:val="0"/>
-          <w14:ligatures w14:val="none"/>
-        </w:rPr>
-        <w:t xml:space="preserve"> is known to have a very slow mutation rate. How do the authors establish a threshold for what constitutes a "recent transmission event" versus an unrelated infection? What are the inherent risks of setting a Single Nucleotide Polymorphism (SNP) threshold too low or too high when dealing with slow-evolving pathogens?</w:t>
-      </w:r>
+        </w:rPr>
+        <w:t xml:space="preserve"> is known to have a very slow mutation rate.</w:t>
+      </w:r>
+      <w:r>
+        <w:rPr>
+          <w:rFonts w:ascii="Arial" w:hAnsi="Arial" w:eastAsia="Times New Roman" w:cs="Arial"/>
+          <w:color w:val="1F1F1F"/>
+        </w:rPr>
+        <w:t xml:space="preserve"> How do the authors </w:t>
+      </w:r>
+      <w:r>
+        <w:rPr>
+          <w:rFonts w:ascii="Arial" w:hAnsi="Arial" w:eastAsia="Times New Roman" w:cs="Arial"/>
+          <w:color w:val="1F1F1F"/>
+        </w:rPr>
+        <w:t>establish</w:t>
+      </w:r>
+      <w:r>
+        <w:rPr>
+          <w:rFonts w:ascii="Arial" w:hAnsi="Arial" w:eastAsia="Times New Roman" w:cs="Arial"/>
+          <w:color w:val="1F1F1F"/>
+        </w:rPr>
+        <w:t xml:space="preserve"> a threshold for what constitutes a "recent transmission event" versus an unrelated infection? What are the inherent risks of setting a Single Nucleotide Polymorphism (SNP) threshold too low or too high when dealing with slow-evolving pathogens?</w:t>
+      </w:r>
+    </w:p>
+    <w:p>
+      <w:pPr>
+        <w:spacing w:after="0" w:line="240" w:lineRule="auto"/>
+        <w:ind w:left="720"/>
+        <w:rPr>
+          <w:rFonts w:ascii="Arial" w:hAnsi="Arial" w:eastAsia="Times New Roman" w:cs="Arial"/>
+          <w:color w:val="1F1F1F"/>
+        </w:rPr>
+      </w:pPr>
     </w:p>
     <w:p>
       <w:pPr>
@@ -1991,30 +2670,31 @@
       <w:r>
         <w:rPr>
           <w:rFonts w:ascii="Arial" w:hAnsi="Arial" w:eastAsia="Times New Roman" w:cs="Arial"/>
-          <w:b/>
-          <w:bCs/>
           <w:color w:val="1F1F1F"/>
           <w:kern w:val="0"/>
           <w:bdr w:val="none" w:color="auto" w:sz="0" w:space="0" w:frame="1"/>
           <w14:ligatures w14:val="none"/>
         </w:rPr>
-        <w:t>Data Integration Challenges:</w:t>
-      </w:r>
-      <w:r>
-        <w:rPr>
-          <w:rFonts w:ascii="Arial" w:hAnsi="Arial" w:eastAsia="Times New Roman" w:cs="Arial"/>
-          <w:color w:val="1F1F1F"/>
-          <w:kern w:val="0"/>
-          <w14:ligatures w14:val="none"/>
-        </w:rPr>
-        <w:t xml:space="preserve"> The paper famously combines genomic sequencing with Social Network Analysis (SNA). In what ways did the genomic data validate the social network data, and conversely, where did the social network data help fill in blanks that genomics alone could not resolve</w:t>
-      </w:r>
-      <w:r>
-        <w:rPr>
-          <w:rFonts w:ascii="Arial" w:hAnsi="Arial" w:eastAsia="Times New Roman" w:cs="Arial"/>
-          <w:color w:val="1F1F1F"/>
-          <w:kern w:val="0"/>
-          <w14:ligatures w14:val="none"/>
+        <w:t xml:space="preserve">The paper famously combines genomic sequencing with Social Network Analysis (SNA). In what ways did the genomic data </w:t>
+      </w:r>
+      <w:r>
+        <w:rPr>
+          <w:rFonts w:ascii="Arial" w:hAnsi="Arial" w:eastAsia="Times New Roman" w:cs="Arial"/>
+          <w:color w:val="1F1F1F"/>
+        </w:rPr>
+        <w:t>validate</w:t>
+      </w:r>
+      <w:r>
+        <w:rPr>
+          <w:rFonts w:ascii="Arial" w:hAnsi="Arial" w:eastAsia="Times New Roman" w:cs="Arial"/>
+          <w:color w:val="1F1F1F"/>
+        </w:rPr>
+        <w:t xml:space="preserve"> the social network data, and conversely, where did the social network data help fill in blanks that genomics alone could not resolve</w:t>
+      </w:r>
+      <w:r>
+        <w:rPr>
+          <w:rFonts w:ascii="Arial" w:hAnsi="Arial" w:eastAsia="Times New Roman" w:cs="Arial"/>
+          <w:color w:val="1F1F1F"/>
         </w:rPr>
         <w:t>?</w:t>
       </w:r>
@@ -2077,24 +2757,55 @@
       <w:r>
         <w:rPr>
           <w:rFonts w:ascii="Arial" w:hAnsi="Arial" w:eastAsia="Times New Roman" w:cs="Arial"/>
-          <w:b/>
-          <w:bCs/>
           <w:color w:val="1F1F1F"/>
           <w:kern w:val="0"/>
           <w:bdr w:val="none" w:color="auto" w:sz="0" w:space="0" w:frame="1"/>
           <w14:ligatures w14:val="none"/>
         </w:rPr>
-        <w:t>The Myth of Increased Virulence:</w:t>
-      </w:r>
-      <w:r>
-        <w:rPr>
-          <w:rFonts w:ascii="Arial" w:hAnsi="Arial" w:eastAsia="Times New Roman" w:cs="Arial"/>
-          <w:color w:val="1F1F1F"/>
-          <w:kern w:val="0"/>
-          <w14:ligatures w14:val="none"/>
-        </w:rPr>
-        <w:t xml:space="preserve"> When a sudden spike in cases occurs, a common hypothesis is that the pathogen mutated to become more infectious or virulent. Gardy et al. disproved this by showing the outbreak strain was genetically stable and matched historical isolates. What does this finding teach us about the role of host and environmental factors versus pathogen evolution in driving outbreaks?</w:t>
-      </w:r>
+        <w:t xml:space="preserve">When a sudden </w:t>
+      </w:r>
+      <w:bookmarkStart w:name="_Int_OweQRe6B" w:id="830429040"/>
+      <w:r>
+        <w:rPr>
+          <w:rFonts w:ascii="Arial" w:hAnsi="Arial" w:eastAsia="Times New Roman" w:cs="Arial"/>
+          <w:color w:val="1F1F1F"/>
+        </w:rPr>
+        <w:t xml:space="preserve">spike </w:t>
+      </w:r>
+      <w:bookmarkStart w:name="_Int_biTBudEo" w:id="1389214151"/>
+      <w:r>
+        <w:rPr>
+          <w:rFonts w:ascii="Arial" w:hAnsi="Arial" w:eastAsia="Times New Roman" w:cs="Arial"/>
+          <w:color w:val="1F1F1F"/>
+        </w:rPr>
+        <w:t>in cases</w:t>
+      </w:r>
+      <w:bookmarkEnd w:id="830429040"/>
+      <w:r>
+        <w:rPr>
+          <w:rFonts w:ascii="Arial" w:hAnsi="Arial" w:eastAsia="Times New Roman" w:cs="Arial"/>
+          <w:color w:val="1F1F1F"/>
+        </w:rPr>
+        <w:t xml:space="preserve"> occurs</w:t>
+      </w:r>
+      <w:bookmarkEnd w:id="1389214151"/>
+      <w:r>
+        <w:rPr>
+          <w:rFonts w:ascii="Arial" w:hAnsi="Arial" w:eastAsia="Times New Roman" w:cs="Arial"/>
+          <w:color w:val="1F1F1F"/>
+        </w:rPr>
+        <w:t>, a common hypothesis is that the pathogen mutated to become more infectious or virulent. Gardy et al. disproved this by showing the outbreak strain was genetically stable and matched historical isolates. What does this finding teach us about the role of host and environmental factors versus pathogen evolution in driving outbreaks?</w:t>
+      </w:r>
+    </w:p>
+    <w:p>
+      <w:pPr>
+        <w:spacing w:after="0" w:line="240" w:lineRule="auto"/>
+        <w:ind w:left="720"/>
+        <w:rPr>
+          <w:rFonts w:ascii="Arial" w:hAnsi="Arial" w:eastAsia="Times New Roman" w:cs="Arial"/>
+          <w:color w:val="1F1F1F"/>
+        </w:rPr>
+      </w:pPr>
     </w:p>
     <w:p>
       <w:pPr>
@@ -2113,24 +2824,37 @@
       <w:r>
         <w:rPr>
           <w:rFonts w:ascii="Arial" w:hAnsi="Arial" w:eastAsia="Times New Roman" w:cs="Arial"/>
-          <w:b/>
-          <w:bCs/>
           <w:color w:val="1F1F1F"/>
           <w:kern w:val="0"/>
           <w:bdr w:val="none" w:color="auto" w:sz="0" w:space="0" w:frame="1"/>
           <w14:ligatures w14:val="none"/>
         </w:rPr>
-        <w:t>Superspreading vs. Structural Vulnerability:</w:t>
-      </w:r>
-      <w:r>
-        <w:rPr>
-          <w:rFonts w:ascii="Arial" w:hAnsi="Arial" w:eastAsia="Times New Roman" w:cs="Arial"/>
-          <w:color w:val="1F1F1F"/>
-          <w:kern w:val="0"/>
-          <w14:ligatures w14:val="none"/>
-        </w:rPr>
-        <w:t xml:space="preserve"> The study identifies specific individuals who acted as key nodes in the transmission network, heavily linked to crack cocaine use and specific locations. How do the authors distinguish between a biological "superspreader" (someone shedding more bacteria) and a socio-environmental "superspreading environment"?</w:t>
-      </w:r>
+        <w:t xml:space="preserve">The study </w:t>
+      </w:r>
+      <w:r>
+        <w:rPr>
+          <w:rFonts w:ascii="Arial" w:hAnsi="Arial" w:eastAsia="Times New Roman" w:cs="Arial"/>
+          <w:color w:val="1F1F1F"/>
+        </w:rPr>
+        <w:t>identifies</w:t>
+      </w:r>
+      <w:r>
+        <w:rPr>
+          <w:rFonts w:ascii="Arial" w:hAnsi="Arial" w:eastAsia="Times New Roman" w:cs="Arial"/>
+          <w:color w:val="1F1F1F"/>
+        </w:rPr>
+        <w:t xml:space="preserve"> specific individuals who acted as key nodes in the transmission network, heavily linked to crack cocaine use and specific locations. How do the authors distinguish between a biological "superspreader" (someone shedding more bacteria) and a socio-environmental "superspreading environment"?</w:t>
+      </w:r>
+    </w:p>
+    <w:p>
+      <w:pPr>
+        <w:spacing w:after="0" w:line="240" w:lineRule="auto"/>
+        <w:ind w:left="720"/>
+        <w:rPr>
+          <w:rFonts w:ascii="Arial" w:hAnsi="Arial" w:eastAsia="Times New Roman" w:cs="Arial"/>
+          <w:color w:val="1F1F1F"/>
+        </w:rPr>
+      </w:pPr>
     </w:p>
     <w:p>
       <w:pPr>
@@ -2149,33 +2873,19 @@
       <w:r>
         <w:rPr>
           <w:rFonts w:ascii="Arial" w:hAnsi="Arial" w:eastAsia="Times New Roman" w:cs="Arial"/>
-          <w:b/>
-          <w:bCs/>
           <w:color w:val="1F1F1F"/>
           <w:kern w:val="0"/>
           <w:bdr w:val="none" w:color="auto" w:sz="0" w:space="0" w:frame="1"/>
           <w14:ligatures w14:val="none"/>
         </w:rPr>
-        <w:t>Directionality of Transmission:</w:t>
-      </w:r>
-      <w:r>
-        <w:rPr>
-          <w:rFonts w:ascii="Arial" w:hAnsi="Arial" w:eastAsia="Times New Roman" w:cs="Arial"/>
-          <w:color w:val="1F1F1F"/>
-          <w:kern w:val="0"/>
-          <w14:ligatures w14:val="none"/>
-        </w:rPr>
-        <w:t xml:space="preserve"> While the phylogenetic tree shows how closely related the isolates are, a tree alone rarely proves exactly </w:t>
-      </w:r>
-      <w:r>
-        <w:rPr>
-          <w:rFonts w:ascii="Arial" w:hAnsi="Arial" w:eastAsia="Times New Roman" w:cs="Arial"/>
-          <w:i/>
-          <w:iCs/>
-          <w:color w:val="1F1F1F"/>
-          <w:kern w:val="0"/>
-          <w:bdr w:val="none" w:color="auto" w:sz="0" w:space="0" w:frame="1"/>
-          <w14:ligatures w14:val="none"/>
+        <w:t xml:space="preserve">While the phylogenetic tree shows how closely related the isolates are, a tree alone rarely proves exactly </w:t>
+      </w:r>
+      <w:r>
+        <w:rPr>
+          <w:rFonts w:ascii="Arial" w:hAnsi="Arial" w:eastAsia="Times New Roman" w:cs="Arial"/>
+          <w:i w:val="1"/>
+          <w:iCs w:val="1"/>
+          <w:color w:val="1F1F1F"/>
         </w:rPr>
         <w:t>who</w:t>
       </w:r>
@@ -2183,20 +2893,15 @@
         <w:rPr>
           <w:rFonts w:ascii="Arial" w:hAnsi="Arial" w:eastAsia="Times New Roman" w:cs="Arial"/>
           <w:color w:val="1F1F1F"/>
-          <w:kern w:val="0"/>
-          <w14:ligatures w14:val="none"/>
         </w:rPr>
         <w:t xml:space="preserve"> infected </w:t>
       </w:r>
       <w:r>
         <w:rPr>
           <w:rFonts w:ascii="Arial" w:hAnsi="Arial" w:eastAsia="Times New Roman" w:cs="Arial"/>
-          <w:i/>
-          <w:iCs/>
-          <w:color w:val="1F1F1F"/>
-          <w:kern w:val="0"/>
-          <w:bdr w:val="none" w:color="auto" w:sz="0" w:space="0" w:frame="1"/>
-          <w14:ligatures w14:val="none"/>
+          <w:i w:val="1"/>
+          <w:iCs w:val="1"/>
+          <w:color w:val="1F1F1F"/>
         </w:rPr>
         <w:t>whom</w:t>
       </w:r>
@@ -2204,8 +2909,6 @@
         <w:rPr>
           <w:rFonts w:ascii="Arial" w:hAnsi="Arial" w:eastAsia="Times New Roman" w:cs="Arial"/>
           <w:color w:val="1F1F1F"/>
-          <w:kern w:val="0"/>
-          <w14:ligatures w14:val="none"/>
         </w:rPr>
         <w:t>. How did the integration of epidemiological data (like illicit drug use timelines and housing history) allow the authors to infer the directionality of transmission in this cohort?</w:t>
       </w:r>
@@ -2267,24 +2970,51 @@
       <w:r>
         <w:rPr>
           <w:rFonts w:ascii="Arial" w:hAnsi="Arial" w:eastAsia="Times New Roman" w:cs="Arial"/>
-          <w:b/>
-          <w:bCs/>
           <w:color w:val="1F1F1F"/>
           <w:kern w:val="0"/>
           <w:bdr w:val="none" w:color="auto" w:sz="0" w:space="0" w:frame="1"/>
           <w14:ligatures w14:val="none"/>
         </w:rPr>
-        <w:t>Granularity and Stigmatization:</w:t>
-      </w:r>
-      <w:r>
-        <w:rPr>
-          <w:rFonts w:ascii="Arial" w:hAnsi="Arial" w:eastAsia="Times New Roman" w:cs="Arial"/>
-          <w:color w:val="1F1F1F"/>
-          <w:kern w:val="0"/>
-          <w14:ligatures w14:val="none"/>
-        </w:rPr>
-        <w:t xml:space="preserve"> Combining high-resolution genomics with detailed social networks allowed researchers to pinpoint specific houses and social behaviors (e.g., crack cocaine use). What ethical considerations and privacy risks arise when genomic data becomes specific enough to potentially identify marginalized individuals or specific households in a small community?</w:t>
-      </w:r>
+        <w:t xml:space="preserve">Combining high-resolution genomics with detailed social networks </w:t>
+      </w:r>
+      <w:r>
+        <w:rPr>
+          <w:rFonts w:ascii="Arial" w:hAnsi="Arial" w:eastAsia="Times New Roman" w:cs="Arial"/>
+          <w:color w:val="1F1F1F"/>
+        </w:rPr>
+        <w:t>allowed</w:t>
+      </w:r>
+      <w:r>
+        <w:rPr>
+          <w:rFonts w:ascii="Arial" w:hAnsi="Arial" w:eastAsia="Times New Roman" w:cs="Arial"/>
+          <w:color w:val="1F1F1F"/>
+        </w:rPr>
+        <w:t xml:space="preserve"> researchers to pinpoint specific houses and social behaviors (e.g., crack cocaine use). What ethical considerations and privacy risks arise when genomic data becomes specific enough to potentially </w:t>
+      </w:r>
+      <w:r>
+        <w:rPr>
+          <w:rFonts w:ascii="Arial" w:hAnsi="Arial" w:eastAsia="Times New Roman" w:cs="Arial"/>
+          <w:color w:val="1F1F1F"/>
+        </w:rPr>
+        <w:t>identify</w:t>
+      </w:r>
+      <w:r>
+        <w:rPr>
+          <w:rFonts w:ascii="Arial" w:hAnsi="Arial" w:eastAsia="Times New Roman" w:cs="Arial"/>
+          <w:color w:val="1F1F1F"/>
+        </w:rPr>
+        <w:t xml:space="preserve"> marginalized individuals or specific households in a small community?</w:t>
+      </w:r>
+    </w:p>
+    <w:p>
+      <w:pPr>
+        <w:spacing w:after="0" w:line="240" w:lineRule="auto"/>
+        <w:ind w:left="720"/>
+        <w:rPr>
+          <w:rFonts w:ascii="Arial" w:hAnsi="Arial" w:eastAsia="Times New Roman" w:cs="Arial"/>
+          <w:color w:val="1F1F1F"/>
+        </w:rPr>
+      </w:pPr>
     </w:p>
     <w:p>
       <w:pPr>
@@ -2303,23 +3033,68 @@
       <w:r>
         <w:rPr>
           <w:rFonts w:ascii="Arial" w:hAnsi="Arial" w:eastAsia="Times New Roman" w:cs="Arial"/>
-          <w:b/>
-          <w:bCs/>
           <w:color w:val="1F1F1F"/>
           <w:kern w:val="0"/>
           <w:bdr w:val="none" w:color="auto" w:sz="0" w:space="0" w:frame="1"/>
           <w14:ligatures w14:val="none"/>
         </w:rPr>
-        <w:t>Retrospective vs. Prospective Utility:</w:t>
-      </w:r>
-      <w:r>
-        <w:rPr>
-          <w:rFonts w:ascii="Arial" w:hAnsi="Arial" w:eastAsia="Times New Roman" w:cs="Arial"/>
-          <w:color w:val="1F1F1F"/>
-          <w:kern w:val="0"/>
-          <w14:ligatures w14:val="none"/>
-        </w:rPr>
-        <w:t xml:space="preserve"> This study was largely retrospective, piecing together an outbreak after it occurred to demonstrate a proof-of-concept. If this exact methodology were applied prospectively (in real-time as cases popped up), how would it change the day-to-day operations of a tuberculosis control program? What bottlenecks would a public health department face?</w:t>
+        <w:t xml:space="preserve">This study was </w:t>
+      </w:r>
+      <w:r>
+        <w:rPr>
+          <w:rFonts w:ascii="Arial" w:hAnsi="Arial" w:eastAsia="Times New Roman" w:cs="Arial"/>
+          <w:color w:val="1F1F1F"/>
+        </w:rPr>
+        <w:t>largely retrospective</w:t>
+      </w:r>
+      <w:r>
+        <w:rPr>
+          <w:rFonts w:ascii="Arial" w:hAnsi="Arial" w:eastAsia="Times New Roman" w:cs="Arial"/>
+          <w:color w:val="1F1F1F"/>
+        </w:rPr>
+        <w:t xml:space="preserve">, piecing together an outbreak after it occurred to </w:t>
+      </w:r>
+      <w:r>
+        <w:rPr>
+          <w:rFonts w:ascii="Arial" w:hAnsi="Arial" w:eastAsia="Times New Roman" w:cs="Arial"/>
+          <w:color w:val="1F1F1F"/>
+        </w:rPr>
+        <w:t>demonstrate</w:t>
+      </w:r>
+      <w:r>
+        <w:rPr>
+          <w:rFonts w:ascii="Arial" w:hAnsi="Arial" w:eastAsia="Times New Roman" w:cs="Arial"/>
+          <w:color w:val="1F1F1F"/>
+        </w:rPr>
+        <w:t xml:space="preserve"> a proof-of-concept. If this exact </w:t>
+      </w:r>
+      <w:r>
+        <w:rPr>
+          <w:rFonts w:ascii="Arial" w:hAnsi="Arial" w:eastAsia="Times New Roman" w:cs="Arial"/>
+          <w:color w:val="1F1F1F"/>
+        </w:rPr>
+        <w:t>methodology</w:t>
+      </w:r>
+      <w:r>
+        <w:rPr>
+          <w:rFonts w:ascii="Arial" w:hAnsi="Arial" w:eastAsia="Times New Roman" w:cs="Arial"/>
+          <w:color w:val="1F1F1F"/>
+        </w:rPr>
+        <w:t xml:space="preserve"> were applied prospectively (in real-</w:t>
+      </w:r>
+      <w:r>
+        <w:rPr>
+          <w:rFonts w:ascii="Arial" w:hAnsi="Arial" w:eastAsia="Times New Roman" w:cs="Arial"/>
+          <w:color w:val="1F1F1F"/>
+        </w:rPr>
+        <w:t>time as</w:t>
+      </w:r>
+      <w:r>
+        <w:rPr>
+          <w:rFonts w:ascii="Arial" w:hAnsi="Arial" w:eastAsia="Times New Roman" w:cs="Arial"/>
+          <w:color w:val="1F1F1F"/>
+        </w:rPr>
+        <w:t xml:space="preserve"> cases popped up), how would it change the day-to-day operations of a tuberculosis control program? What bottlenecks would a public health department face?</w:t>
       </w:r>
     </w:p>
     <w:p/>
@@ -2332,6 +3107,20 @@
     </w:sectPr>
   </w:body>
 </w:document>
+</file>
+
+<file path=word/intelligence2.xml><?xml version="1.0" encoding="utf-8"?>
+<int2:intelligence xmlns:int2="http://schemas.microsoft.com/office/intelligence/2020/intelligence">
+  <int2:observations>
+    <int2:bookmark int2:bookmarkName="_Int_biTBudEo" int2:invalidationBookmarkName="" int2:hashCode="Ro27wuP5WKK8Pg" int2:id="B4xL9Rwe">
+      <int2:state int2:type="gram" int2:value="Rejected"/>
+    </int2:bookmark>
+    <int2:bookmark int2:bookmarkName="_Int_OweQRe6B" int2:invalidationBookmarkName="" int2:hashCode="qBZWW5K9JVQBJL" int2:id="bTGSmJm0">
+      <int2:state int2:type="gram" int2:value="Rejected"/>
+    </int2:bookmark>
+  </int2:observations>
+  <int2:intelligenceSettings/>
+</int2:intelligence>
 </file>
 
 <file path=word/numbering.xml><?xml version="1.0" encoding="utf-8"?>
@@ -4675,6 +5464,17 @@
     <w:basedOn w:val="DefaultParagraphFont"/>
     <w:rsid w:val="00EA7F3E"/>
   </w:style>
+  <w:style w:type="character" w:styleId="Hyperlink">
+    <w:uiPriority w:val="99"/>
+    <w:name w:val="Hyperlink"/>
+    <w:basedOn w:val="DefaultParagraphFont"/>
+    <w:unhideWhenUsed/>
+    <w:rsid w:val="584B9591"/>
+    <w:rPr>
+      <w:color w:val="467886"/>
+      <w:u w:val="single"/>
+    </w:rPr>
+  </w:style>
 </w:styles>
 </file>
 

</xml_diff>